<commit_message>
court(wva): brief-on-the-merits gated on the model at HEAD, latex reported (fb-595.54.21)
Re-rendered on master's model: Word's table of authorities now pages the short-form
marks (625/625 lines). LaTeX still meets the note typst sets a page after its mark
(B5); cross_engine: gate with cross_engine_latex: report (fb-595.54.21).

Co-Authored-By: Claude Opus 5.5 <noreply@anthropic.com>
</commit_message>
<xml_diff>
--- a/courts/fourth-circuit/west-virginia/state/supreme-court/brief-on-the-merits/usage/OUTPUT-brief-on-the-merits.docx
+++ b/courts/fourth-circuit/west-virginia/state/supreme-court/brief-on-the-merits/usage/OUTPUT-brief-on-the-merits.docx
@@ -5069,7 +5069,7 @@
         <w:tab/>
       </w:r>
       <w:r>
-        <w:t xml:space="preserve">14, 16</w:t>
+        <w:t xml:space="preserve">14, 15, 16</w:t>
       </w:r>
     </w:p>
     <w:p>
@@ -5648,7 +5648,7 @@
           <w:tab w:val="right" w:leader="dot" w:pos="9360"/>
         </w:tabs>
         <w:spacing w:before="144" w:after="0" w:line="276" w:lineRule="exact"/>
-        <w:ind w:left="576" w:right="1120" w:hanging="576"/>
+        <w:ind w:left="576" w:right="1320" w:hanging="576"/>
       </w:pPr>
       <w:r>
         <w:rPr>
@@ -5841,7 +5841,7 @@
         <w:tab/>
       </w:r>
       <w:r>
-        <w:t xml:space="preserve">13, 15, 16</w:t>
+        <w:t xml:space="preserve">13, 14, 15, 16</w:t>
       </w:r>
     </w:p>
     <w:p>
@@ -6511,7 +6511,7 @@
         <w:tab/>
       </w:r>
       <w:r>
-        <w:t xml:space="preserve">13</w:t>
+        <w:t xml:space="preserve">13, 14</w:t>
       </w:r>
     </w:p>
     <w:p>

</xml_diff>